<commit_message>
Correções depois do Segundo Encontro
</commit_message>
<xml_diff>
--- a/DOC/Exemplos_NumPy.docx
+++ b/DOC/Exemplos_NumPy.docx
@@ -299,6 +299,115 @@
     <w:p>
       <w:pPr>
         <w:spacing w:after="0"/>
+        <w:rPr>
+          <w:b/>
+          <w:bCs/>
+        </w:rPr>
+      </w:pPr>
+      <w:r>
+        <w:rPr>
+          <w:b/>
+          <w:bCs/>
+        </w:rPr>
+        <w:t>a = np.zeros(5)</w:t>
+      </w:r>
+    </w:p>
+    <w:p>
+      <w:pPr>
+        <w:spacing w:after="0"/>
+      </w:pPr>
+      <w:r>
+        <w:t>print(type(a))</w:t>
+      </w:r>
+    </w:p>
+    <w:p>
+      <w:pPr>
+        <w:spacing w:after="0"/>
+      </w:pPr>
+      <w:r>
+        <w:t>print(type(a[0]))</w:t>
+      </w:r>
+    </w:p>
+    <w:p>
+      <w:pPr>
+        <w:spacing w:after="0"/>
+      </w:pPr>
+      <w:r>
+        <w:t>print(a)</w:t>
+      </w:r>
+    </w:p>
+    <w:p>
+      <w:pPr>
+        <w:spacing w:after="0"/>
+      </w:pPr>
+      <w:r>
+        <w:t>print()</w:t>
+      </w:r>
+    </w:p>
+    <w:p>
+      <w:pPr>
+        <w:spacing w:after="0"/>
+        <w:rPr>
+          <w:b/>
+          <w:bCs/>
+        </w:rPr>
+      </w:pPr>
+      <w:r>
+        <w:rPr>
+          <w:b/>
+          <w:bCs/>
+        </w:rPr>
+        <w:t>b = np.zeros(7, dtype=int)</w:t>
+      </w:r>
+    </w:p>
+    <w:p>
+      <w:pPr>
+        <w:spacing w:after="0"/>
+      </w:pPr>
+      <w:r>
+        <w:t>print(type(b))</w:t>
+      </w:r>
+    </w:p>
+    <w:p>
+      <w:pPr>
+        <w:spacing w:after="0"/>
+      </w:pPr>
+      <w:r>
+        <w:t>print(type(b[0]))</w:t>
+      </w:r>
+    </w:p>
+    <w:p>
+      <w:pPr>
+        <w:spacing w:after="0"/>
+      </w:pPr>
+      <w:r>
+        <w:t>print(b)</w:t>
+      </w:r>
+    </w:p>
+    <w:p>
+      <w:pPr>
+        <w:spacing w:after="0"/>
+      </w:pPr>
+      <w:r>
+        <w:t>#----------------------</w:t>
+      </w:r>
+    </w:p>
+    <w:p>
+      <w:pPr>
+        <w:spacing w:after="0"/>
+      </w:pPr>
+      <w:r>
+        <w:t>import numpy as np</w:t>
+      </w:r>
+    </w:p>
+    <w:p>
+      <w:pPr>
+        <w:spacing w:after="0"/>
+      </w:pPr>
+    </w:p>
+    <w:p>
+      <w:pPr>
+        <w:spacing w:after="0"/>
       </w:pPr>
       <w:r>
         <w:t>a = np.</w:t>
@@ -308,10 +417,20 @@
           <w:b/>
           <w:bCs/>
         </w:rPr>
-        <w:t>zeros</w:t>
-      </w:r>
-      <w:r>
-        <w:t>(5)</w:t>
+        <w:t>random</w:t>
+      </w:r>
+      <w:r>
+        <w:t>.</w:t>
+      </w:r>
+      <w:r>
+        <w:rPr>
+          <w:b/>
+          <w:bCs/>
+        </w:rPr>
+        <w:t>rand</w:t>
+      </w:r>
+      <w:r>
+        <w:t>(4)</w:t>
       </w:r>
     </w:p>
     <w:p>
@@ -326,10 +445,20 @@
           <w:b/>
           <w:bCs/>
         </w:rPr>
-        <w:t>zeros</w:t>
-      </w:r>
-      <w:r>
-        <w:t>(10)</w:t>
+        <w:t>random</w:t>
+      </w:r>
+      <w:r>
+        <w:t>.</w:t>
+      </w:r>
+      <w:r>
+        <w:rPr>
+          <w:b/>
+          <w:bCs/>
+        </w:rPr>
+        <w:t>rand</w:t>
+      </w:r>
+      <w:r>
+        <w:t>(6)</w:t>
       </w:r>
     </w:p>
     <w:p>
@@ -366,7 +495,7 @@
         <w:spacing w:after="0"/>
       </w:pPr>
       <w:r>
-        <w:t>print(type(b))</w:t>
+        <w:t>print(type(b)</w:t>
       </w:r>
     </w:p>
     <w:p>
@@ -375,136 +504,6 @@
       </w:pPr>
       <w:r>
         <w:t>print(b)</w:t>
-      </w:r>
-    </w:p>
-    <w:p>
-      <w:pPr>
-        <w:spacing w:after="0"/>
-      </w:pPr>
-      <w:r>
-        <w:t>#----------------------</w:t>
-      </w:r>
-    </w:p>
-    <w:p>
-      <w:pPr>
-        <w:spacing w:after="0"/>
-      </w:pPr>
-      <w:r>
-        <w:t>import numpy as np</w:t>
-      </w:r>
-    </w:p>
-    <w:p>
-      <w:pPr>
-        <w:spacing w:after="0"/>
-      </w:pPr>
-    </w:p>
-    <w:p>
-      <w:pPr>
-        <w:spacing w:after="0"/>
-      </w:pPr>
-      <w:r>
-        <w:t>a = np.</w:t>
-      </w:r>
-      <w:r>
-        <w:rPr>
-          <w:b/>
-          <w:bCs/>
-        </w:rPr>
-        <w:t>random</w:t>
-      </w:r>
-      <w:r>
-        <w:t>.</w:t>
-      </w:r>
-      <w:r>
-        <w:rPr>
-          <w:b/>
-          <w:bCs/>
-        </w:rPr>
-        <w:t>rand</w:t>
-      </w:r>
-      <w:r>
-        <w:t>(4)</w:t>
-      </w:r>
-    </w:p>
-    <w:p>
-      <w:pPr>
-        <w:spacing w:after="0"/>
-      </w:pPr>
-      <w:r>
-        <w:t>b = np.</w:t>
-      </w:r>
-      <w:r>
-        <w:rPr>
-          <w:b/>
-          <w:bCs/>
-        </w:rPr>
-        <w:t>random</w:t>
-      </w:r>
-      <w:r>
-        <w:t>.</w:t>
-      </w:r>
-      <w:r>
-        <w:rPr>
-          <w:b/>
-          <w:bCs/>
-        </w:rPr>
-        <w:t>rand</w:t>
-      </w:r>
-      <w:r>
-        <w:t>(6)</w:t>
-      </w:r>
-    </w:p>
-    <w:p>
-      <w:pPr>
-        <w:spacing w:after="0"/>
-      </w:pPr>
-    </w:p>
-    <w:p>
-      <w:pPr>
-        <w:spacing w:after="0"/>
-      </w:pPr>
-      <w:r>
-        <w:t>print(type(a))</w:t>
-      </w:r>
-    </w:p>
-    <w:p>
-      <w:pPr>
-        <w:spacing w:after="0"/>
-      </w:pPr>
-      <w:r>
-        <w:t>print(a)</w:t>
-      </w:r>
-    </w:p>
-    <w:p>
-      <w:pPr>
-        <w:spacing w:after="0"/>
-      </w:pPr>
-      <w:r>
-        <w:t>print()</w:t>
-      </w:r>
-    </w:p>
-    <w:p>
-      <w:pPr>
-        <w:spacing w:after="0"/>
-      </w:pPr>
-      <w:r>
-        <w:t>print(type(b)</w:t>
-      </w:r>
-    </w:p>
-    <w:p>
-      <w:pPr>
-        <w:spacing w:after="0"/>
-      </w:pPr>
-      <w:r>
-        <w:t>print(b)</w:t>
-      </w:r>
-    </w:p>
-    <w:p>
-      <w:pPr>
-        <w:spacing w:after="0"/>
-      </w:pPr>
-      <w:r>
-        <w:t>#----------------------</w:t>
       </w:r>
     </w:p>
     <w:p>
@@ -743,9 +742,17 @@
     <w:p>
       <w:pPr>
         <w:spacing w:after="0"/>
-      </w:pPr>
-      <w:r>
-        <w:t>a = np.array([]) # array vazio</w:t>
+        <w:rPr>
+          <w:b/>
+          <w:bCs/>
+        </w:rPr>
+      </w:pPr>
+      <w:r>
+        <w:rPr>
+          <w:b/>
+          <w:bCs/>
+        </w:rPr>
+        <w:t>a = np.array([], dtype=int) # criando um array vazio</w:t>
       </w:r>
     </w:p>
     <w:p>
@@ -765,11 +772,6 @@
       <w:pPr>
         <w:spacing w:after="0"/>
       </w:pPr>
-    </w:p>
-    <w:p>
-      <w:pPr>
-        <w:spacing w:after="0"/>
-      </w:pPr>
       <w:r>
         <w:t>print()</w:t>
       </w:r>
@@ -785,17 +787,25 @@
     <w:p>
       <w:pPr>
         <w:spacing w:after="0"/>
-        <w:rPr>
-          <w:b/>
-          <w:bCs/>
-        </w:rPr>
-      </w:pPr>
-      <w:r>
-        <w:rPr>
-          <w:b/>
-          <w:bCs/>
-        </w:rPr>
-        <w:t>    valor = int(input(f"Digite o valor do elemento {i+1}: "))</w:t>
+      </w:pPr>
+      <w:r>
+        <w:t>    valor = int(input(f"Digite o {i+1}o. valor: "))</w:t>
+      </w:r>
+    </w:p>
+    <w:p>
+      <w:pPr>
+        <w:spacing w:after="0"/>
+        <w:rPr>
+          <w:b/>
+          <w:bCs/>
+        </w:rPr>
+      </w:pPr>
+      <w:r>
+        <w:rPr>
+          <w:b/>
+          <w:bCs/>
+        </w:rPr>
+        <w:t>    # adicionando um valor ao array</w:t>
       </w:r>
     </w:p>
     <w:p>
@@ -848,15 +858,15 @@
           <w:b/>
           <w:bCs/>
         </w:rPr>
-        <w:t>    print(f"{a[i]:.0f}", end="")</w:t>
-      </w:r>
-    </w:p>
-    <w:p>
-      <w:pPr>
-        <w:spacing w:after="0"/>
-      </w:pPr>
-      <w:r>
-        <w:t>    if (i != (n-1)):</w:t>
+        <w:t>    print(a[i], end="")</w:t>
+      </w:r>
+    </w:p>
+    <w:p>
+      <w:pPr>
+        <w:spacing w:after="0"/>
+      </w:pPr>
+      <w:r>
+        <w:t>    if (i != (n-1)): # não é o último</w:t>
       </w:r>
     </w:p>
     <w:p>
@@ -876,11 +886,8 @@
       </w:r>
     </w:p>
     <w:p>
-      <w:pPr>
-        <w:spacing w:after="0"/>
-      </w:pPr>
-      <w:r>
-        <w:t>#----------------------</w:t>
+      <w:r>
+        <w:br w:type="page"/>
       </w:r>
     </w:p>
     <w:p>
@@ -1039,37 +1046,17 @@
     <w:p>
       <w:pPr>
         <w:spacing w:after="0"/>
-      </w:pPr>
-      <w:r>
-        <w:t>a = np.</w:t>
-      </w:r>
-      <w:r>
-        <w:rPr>
-          <w:b/>
-          <w:bCs/>
-        </w:rPr>
-        <w:t>zeros</w:t>
-      </w:r>
-      <w:r>
-        <w:t>((2, 3))</w:t>
-      </w:r>
-    </w:p>
-    <w:p>
-      <w:pPr>
-        <w:spacing w:after="0"/>
-      </w:pPr>
-      <w:r>
-        <w:t>b = np.</w:t>
-      </w:r>
-      <w:r>
-        <w:rPr>
-          <w:b/>
-          <w:bCs/>
-        </w:rPr>
-        <w:t>zeros</w:t>
-      </w:r>
-      <w:r>
-        <w:t>((5, 5))</w:t>
+        <w:rPr>
+          <w:b/>
+          <w:bCs/>
+        </w:rPr>
+      </w:pPr>
+      <w:r>
+        <w:rPr>
+          <w:b/>
+          <w:bCs/>
+        </w:rPr>
+        <w:t>a = np.zeros((2, 3))</w:t>
       </w:r>
     </w:p>
     <w:p>
@@ -1090,6 +1077,14 @@
         <w:spacing w:after="0"/>
       </w:pPr>
       <w:r>
+        <w:t>print(type(a[0][0]))</w:t>
+      </w:r>
+    </w:p>
+    <w:p>
+      <w:pPr>
+        <w:spacing w:after="0"/>
+      </w:pPr>
+      <w:r>
         <w:t>print(a)</w:t>
       </w:r>
     </w:p>
@@ -1109,6 +1104,27 @@
     <w:p>
       <w:pPr>
         <w:spacing w:after="0"/>
+        <w:rPr>
+          <w:b/>
+          <w:bCs/>
+        </w:rPr>
+      </w:pPr>
+      <w:r>
+        <w:rPr>
+          <w:b/>
+          <w:bCs/>
+        </w:rPr>
+        <w:t>b = np.zeros((5, 5), dtype=int)</w:t>
+      </w:r>
+    </w:p>
+    <w:p>
+      <w:pPr>
+        <w:spacing w:after="0"/>
+      </w:pPr>
+    </w:p>
+    <w:p>
+      <w:pPr>
+        <w:spacing w:after="0"/>
       </w:pPr>
       <w:r>
         <w:t>print(type(b))</w:t>
@@ -1119,6 +1135,14 @@
         <w:spacing w:after="0"/>
       </w:pPr>
       <w:r>
+        <w:t>print(type(b[0][0]))</w:t>
+      </w:r>
+    </w:p>
+    <w:p>
+      <w:pPr>
+        <w:spacing w:after="0"/>
+      </w:pPr>
+      <w:r>
         <w:t>print(b)</w:t>
       </w:r>
     </w:p>
@@ -1207,14 +1231,6 @@
       </w:pPr>
       <w:r>
         <w:t>print(b)</w:t>
-      </w:r>
-    </w:p>
-    <w:p>
-      <w:pPr>
-        <w:spacing w:after="0"/>
-      </w:pPr>
-      <w:r>
-        <w:t>#----------------------</w:t>
       </w:r>
     </w:p>
     <w:p>
@@ -1241,49 +1257,36 @@
         <w:spacing w:after="0"/>
       </w:pPr>
       <w:r>
-        <w:t>a = np.array([]) # array vazio</w:t>
-      </w:r>
-    </w:p>
-    <w:p>
-      <w:pPr>
-        <w:spacing w:after="0"/>
-      </w:pPr>
-    </w:p>
-    <w:p>
-      <w:pPr>
-        <w:spacing w:after="0"/>
-      </w:pPr>
-      <w:r>
-        <w:t>nl = int(input("Digite a quantidade de linhas.: "))</w:t>
-      </w:r>
-    </w:p>
-    <w:p>
-      <w:pPr>
-        <w:spacing w:after="0"/>
-      </w:pPr>
-      <w:r>
-        <w:t>nc = int(input("Digite a quantidade de colunas: "))</w:t>
-      </w:r>
-    </w:p>
-    <w:p>
-      <w:pPr>
-        <w:spacing w:after="0"/>
-      </w:pPr>
-    </w:p>
-    <w:p>
-      <w:pPr>
-        <w:spacing w:after="0"/>
-        <w:rPr>
-          <w:b/>
-          <w:bCs/>
-        </w:rPr>
-      </w:pPr>
-      <w:r>
-        <w:rPr>
-          <w:b/>
-          <w:bCs/>
-        </w:rPr>
-        <w:t>m = np.empty((0, nc), dtype=int) # cria uma matriz vazia</w:t>
+        <w:t>nl = int(input("Informe a quantidade de linha..: "))</w:t>
+      </w:r>
+    </w:p>
+    <w:p>
+      <w:pPr>
+        <w:spacing w:after="0"/>
+      </w:pPr>
+      <w:r>
+        <w:t>nc = int(input("Informe a quantidade de colunas: "))</w:t>
+      </w:r>
+    </w:p>
+    <w:p>
+      <w:pPr>
+        <w:spacing w:after="0"/>
+      </w:pPr>
+    </w:p>
+    <w:p>
+      <w:pPr>
+        <w:spacing w:after="0"/>
+        <w:rPr>
+          <w:b/>
+          <w:bCs/>
+        </w:rPr>
+      </w:pPr>
+      <w:r>
+        <w:rPr>
+          <w:b/>
+          <w:bCs/>
+        </w:rPr>
+        <w:t>m = [] # criou uma lista vazia</w:t>
       </w:r>
     </w:p>
     <w:p>
@@ -1310,8 +1313,32 @@
     <w:p>
       <w:pPr>
         <w:spacing w:after="0"/>
-      </w:pPr>
-      <w:r>
+        <w:rPr>
+          <w:b/>
+          <w:bCs/>
+        </w:rPr>
+      </w:pPr>
+      <w:r>
+        <w:rPr>
+          <w:b/>
+          <w:bCs/>
+        </w:rPr>
+        <w:t>    # cria a lista 'linha' vazia</w:t>
+      </w:r>
+    </w:p>
+    <w:p>
+      <w:pPr>
+        <w:spacing w:after="0"/>
+        <w:rPr>
+          <w:b/>
+          <w:bCs/>
+        </w:rPr>
+      </w:pPr>
+      <w:r>
+        <w:rPr>
+          <w:b/>
+          <w:bCs/>
+        </w:rPr>
         <w:t>    linha = []</w:t>
       </w:r>
     </w:p>
@@ -1319,6 +1346,19 @@
       <w:pPr>
         <w:spacing w:after="0"/>
       </w:pPr>
+    </w:p>
+    <w:p>
+      <w:pPr>
+        <w:spacing w:after="0"/>
+      </w:pPr>
+      <w:r>
+        <w:t>    print(f"{i+1}a. linha")</w:t>
+      </w:r>
+    </w:p>
+    <w:p>
+      <w:pPr>
+        <w:spacing w:after="0"/>
+      </w:pPr>
       <w:r>
         <w:t>    for j in range(nc):</w:t>
       </w:r>
@@ -1328,55 +1368,137 @@
         <w:spacing w:after="0"/>
       </w:pPr>
       <w:r>
-        <w:t>        item = int(input(f"Digite o elemento [{i}][{j}]: "))</w:t>
-      </w:r>
-    </w:p>
-    <w:p>
-      <w:pPr>
-        <w:spacing w:after="0"/>
-      </w:pPr>
-      <w:r>
-        <w:t>        linha.append(item)</w:t>
-      </w:r>
-    </w:p>
-    <w:p>
-      <w:pPr>
-        <w:spacing w:after="0"/>
-        <w:rPr>
-          <w:b/>
-          <w:bCs/>
-        </w:rPr>
-      </w:pPr>
-      <w:r>
-        <w:rPr>
-          <w:b/>
-          <w:bCs/>
-        </w:rPr>
-        <w:t>    m = np.append(m, [linha], axis=0)</w:t>
-      </w:r>
-    </w:p>
-    <w:p>
-      <w:pPr>
-        <w:spacing w:after="0"/>
-      </w:pPr>
-      <w:r>
-        <w:t>    print()</w:t>
-      </w:r>
-    </w:p>
-    <w:p>
-      <w:pPr>
-        <w:spacing w:after="0"/>
-      </w:pPr>
-      <w:r>
-        <w:t xml:space="preserve">    </w:t>
-      </w:r>
-    </w:p>
-    <w:p>
-      <w:pPr>
-        <w:spacing w:after="0"/>
-      </w:pPr>
-      <w:r>
-        <w:t>print("\nmatriz")</w:t>
+        <w:t>        item = int(input(f"m[{i}, {j}] = "))</w:t>
+      </w:r>
+    </w:p>
+    <w:p>
+      <w:pPr>
+        <w:spacing w:after="0"/>
+        <w:rPr>
+          <w:b/>
+          <w:bCs/>
+        </w:rPr>
+      </w:pPr>
+      <w:r>
+        <w:rPr>
+          <w:b/>
+          <w:bCs/>
+        </w:rPr>
+        <w:t>        # adiciona o 'item' a lista 'linha'</w:t>
+      </w:r>
+    </w:p>
+    <w:p>
+      <w:pPr>
+        <w:spacing w:after="0"/>
+        <w:rPr>
+          <w:b/>
+          <w:bCs/>
+        </w:rPr>
+      </w:pPr>
+      <w:r>
+        <w:rPr>
+          <w:b/>
+          <w:bCs/>
+        </w:rPr>
+        <w:t xml:space="preserve">        linha.append(item)       </w:t>
+      </w:r>
+    </w:p>
+    <w:p>
+      <w:pPr>
+        <w:spacing w:after="0"/>
+      </w:pPr>
+      <w:r>
+        <w:t>    print("----------------------------")</w:t>
+      </w:r>
+    </w:p>
+    <w:p>
+      <w:pPr>
+        <w:spacing w:after="0"/>
+        <w:rPr>
+          <w:b/>
+          <w:bCs/>
+        </w:rPr>
+      </w:pPr>
+      <w:r>
+        <w:rPr>
+          <w:b/>
+          <w:bCs/>
+        </w:rPr>
+        <w:t>    # adiciona a linha 'linha' a lista 'm'</w:t>
+      </w:r>
+    </w:p>
+    <w:p>
+      <w:pPr>
+        <w:spacing w:after="0"/>
+        <w:rPr>
+          <w:b/>
+          <w:bCs/>
+        </w:rPr>
+      </w:pPr>
+      <w:r>
+        <w:rPr>
+          <w:b/>
+          <w:bCs/>
+        </w:rPr>
+        <w:t>    m.append(linha)</w:t>
+      </w:r>
+    </w:p>
+    <w:p>
+      <w:pPr>
+        <w:spacing w:after="0"/>
+      </w:pPr>
+    </w:p>
+    <w:p>
+      <w:pPr>
+        <w:spacing w:after="0"/>
+        <w:rPr>
+          <w:b/>
+          <w:bCs/>
+        </w:rPr>
+      </w:pPr>
+      <w:r>
+        <w:rPr>
+          <w:b/>
+          <w:bCs/>
+        </w:rPr>
+        <w:t># cria a matriz a partir de uma lista</w:t>
+      </w:r>
+    </w:p>
+    <w:p>
+      <w:pPr>
+        <w:spacing w:after="0"/>
+        <w:rPr>
+          <w:b/>
+          <w:bCs/>
+        </w:rPr>
+      </w:pPr>
+      <w:r>
+        <w:rPr>
+          <w:b/>
+          <w:bCs/>
+        </w:rPr>
+        <w:t>minhaMatriz = np.array(m)</w:t>
+      </w:r>
+    </w:p>
+    <w:p>
+      <w:pPr>
+        <w:spacing w:after="0"/>
+      </w:pPr>
+    </w:p>
+    <w:p>
+      <w:pPr>
+        <w:spacing w:after="0"/>
+      </w:pPr>
+      <w:r>
+        <w:t>print()</w:t>
+      </w:r>
+    </w:p>
+    <w:p>
+      <w:pPr>
+        <w:spacing w:after="0"/>
+      </w:pPr>
+      <w:r>
+        <w:t>print("Matriz")</w:t>
       </w:r>
     </w:p>
     <w:p>
@@ -1399,6 +1521,19 @@
       <w:pPr>
         <w:spacing w:after="0"/>
       </w:pPr>
+    </w:p>
+    <w:p>
+      <w:pPr>
+        <w:spacing w:after="0"/>
+      </w:pPr>
+      <w:r>
+        <w:t>    smLinha = 0</w:t>
+      </w:r>
+    </w:p>
+    <w:p>
+      <w:pPr>
+        <w:spacing w:after="0"/>
+      </w:pPr>
       <w:r>
         <w:t>    for j in range(nc):</w:t>
       </w:r>
@@ -1406,17 +1541,56 @@
     <w:p>
       <w:pPr>
         <w:spacing w:after="0"/>
-      </w:pPr>
-      <w:r>
-        <w:t>        print(m[i][j], end="")</w:t>
-      </w:r>
-    </w:p>
-    <w:p>
-      <w:pPr>
-        <w:spacing w:after="0"/>
-      </w:pPr>
-      <w:r>
-        <w:t>        if (j != (nc-1)):</w:t>
+        <w:rPr>
+          <w:b/>
+          <w:bCs/>
+        </w:rPr>
+      </w:pPr>
+      <w:r>
+        <w:t xml:space="preserve">        </w:t>
+      </w:r>
+      <w:r>
+        <w:rPr>
+          <w:b/>
+          <w:bCs/>
+        </w:rPr>
+        <w:t>print(m</w:t>
+      </w:r>
+      <w:r>
+        <w:rPr>
+          <w:b/>
+          <w:bCs/>
+        </w:rPr>
+        <w:t>inhaMatriz[</w:t>
+      </w:r>
+      <w:r>
+        <w:rPr>
+          <w:b/>
+          <w:bCs/>
+        </w:rPr>
+        <w:t>i</w:t>
+      </w:r>
+      <w:r>
+        <w:rPr>
+          <w:b/>
+          <w:bCs/>
+        </w:rPr>
+        <w:t xml:space="preserve">, </w:t>
+      </w:r>
+      <w:r>
+        <w:rPr>
+          <w:b/>
+          <w:bCs/>
+        </w:rPr>
+        <w:t>j], end="")</w:t>
+      </w:r>
+    </w:p>
+    <w:p>
+      <w:pPr>
+        <w:spacing w:after="0"/>
+      </w:pPr>
+      <w:r>
+        <w:t>        if (j != (nc-1)): # não é a última coluna</w:t>
       </w:r>
     </w:p>
     <w:p>
@@ -1432,21 +1606,36 @@
         <w:spacing w:after="0"/>
       </w:pPr>
       <w:r>
-        <w:t>    print(" |")</w:t>
-      </w:r>
-    </w:p>
-    <w:p>
-      <w:pPr>
-        <w:spacing w:after="0"/>
-      </w:pPr>
-      <w:r>
-        <w:t>#----------------------</w:t>
-      </w:r>
-    </w:p>
-    <w:p>
-      <w:pPr>
-        <w:spacing w:after="0"/>
-      </w:pPr>
+        <w:t>        smLinha += m</w:t>
+      </w:r>
+      <w:r>
+        <w:t>inhaMatriz</w:t>
+      </w:r>
+      <w:r>
+        <w:t xml:space="preserve"> </w:t>
+      </w:r>
+      <w:r>
+        <w:t>[i</w:t>
+      </w:r>
+      <w:r>
+        <w:t xml:space="preserve">, </w:t>
+      </w:r>
+      <w:r>
+        <w:t>j]</w:t>
+      </w:r>
+    </w:p>
+    <w:p>
+      <w:pPr>
+        <w:spacing w:after="0"/>
+      </w:pPr>
+    </w:p>
+    <w:p>
+      <w:pPr>
+        <w:spacing w:after="0"/>
+      </w:pPr>
+      <w:r>
+        <w:t>    print(f" | soma = {smLinha}")</w:t>
+      </w:r>
     </w:p>
     <w:p>
       <w:pPr>
@@ -2159,7 +2348,6 @@
   <w:style w:type="character" w:default="1" w:styleId="Fontepargpadro">
     <w:name w:val="Default Paragraph Font"/>
     <w:uiPriority w:val="1"/>
-    <w:semiHidden/>
     <w:unhideWhenUsed/>
   </w:style>
   <w:style w:type="table" w:default="1" w:styleId="Tabelanormal">

</xml_diff>